<commit_message>
Résumé: add Tire Rack Innovation & AI Intern (lead Experience role)
Documents the SMS gateway (FastAPI/Cloud Run fronting the TRACI AI agent
via Twilio; YMMV vehicle resolver; Redis/SQS, 42 tests, keyless CI/CD)
and the Karst app, all AI-assisted. Jun 2026 – Present, South Bend
(hybrid). Condensed the older UITS bullets to keep it one page. HTML +
docx + preview.pdf regenerated.
</commit_message>
<xml_diff>
--- a/resume/Gabriel-Harlan-Resume.docx
+++ b/resume/Gabriel-Harlan-Resume.docx
@@ -280,33 +280,7 @@
                 <w:color w:val="5A4F41"/>
                 <w:sz w:val="18"/>
               </w:rPr>
-              <w:t>Installed, configured, and administered network infrastructure end-to-end.</w:t>
-            </w:r>
-          </w:p>
-          <w:p>
-            <w:pPr>
-              <w:spacing w:after="30"/>
-              <w:ind w:left="230" w:hanging="230"/>
-            </w:pPr>
-            <w:r>
-              <w:rPr>
-                <w:rFonts w:ascii="Schibsted Grotesk" w:hAnsi="Schibsted Grotesk"/>
-                <w:b w:val="0"/>
-                <w:i w:val="0"/>
-                <w:color w:val="F4502A"/>
-                <w:sz w:val="14"/>
-              </w:rPr>
-              <w:t xml:space="preserve">◆  </w:t>
-            </w:r>
-            <w:r>
-              <w:rPr>
-                <w:rFonts w:ascii="Schibsted Grotesk" w:hAnsi="Schibsted Grotesk"/>
-                <w:b w:val="0"/>
-                <w:i w:val="0"/>
-                <w:color w:val="5A4F41"/>
-                <w:sz w:val="18"/>
-              </w:rPr>
-              <w:t>Built and modified computer hardware, software, and operating systems to spec.</w:t>
+              <w:t>Installed, configured, and administered network infrastructure end-to-end, and built/modified computer hardware, software, and operating systems to spec.</w:t>
             </w:r>
           </w:p>
           <w:p>
@@ -337,6 +311,128 @@
           <w:p>
             <w:pPr>
               <w:spacing w:after="40"/>
+            </w:pPr>
+            <w:r>
+              <w:rPr>
+                <w:rFonts w:ascii="Space Mono" w:hAnsi="Space Mono"/>
+                <w:b w:val="0"/>
+                <w:i w:val="0"/>
+                <w:color w:val="5A4F41"/>
+                <w:sz w:val="15"/>
+              </w:rPr>
+              <w:t>Tire Rack · South Bend, Indiana (hybrid)</w:t>
+            </w:r>
+          </w:p>
+          <w:p>
+            <w:pPr>
+              <w:tabs>
+                <w:tab w:pos="6480" w:val="right"/>
+              </w:tabs>
+              <w:spacing w:before="80"/>
+            </w:pPr>
+            <w:r>
+              <w:rPr>
+                <w:rFonts w:ascii="Fraunces" w:hAnsi="Fraunces"/>
+                <w:b/>
+                <w:i w:val="0"/>
+                <w:color w:val="211B14"/>
+                <w:sz w:val="22"/>
+              </w:rPr>
+              <w:t>Innovation &amp; AI Intern</w:t>
+            </w:r>
+            <w:r>
+              <w:rPr>
+                <w:rFonts w:ascii="Space Mono" w:hAnsi="Space Mono"/>
+                <w:b w:val="0"/>
+                <w:i w:val="0"/>
+                <w:color w:val="5A4F41"/>
+                <w:sz w:val="15"/>
+              </w:rPr>
+              <w:tab/>
+              <w:t>Jun 2026 – Present</w:t>
+            </w:r>
+          </w:p>
+          <w:p>
+            <w:pPr>
+              <w:spacing w:after="30"/>
+              <w:ind w:left="230" w:hanging="230"/>
+            </w:pPr>
+            <w:r>
+              <w:rPr>
+                <w:rFonts w:ascii="Schibsted Grotesk" w:hAnsi="Schibsted Grotesk"/>
+                <w:b w:val="0"/>
+                <w:i w:val="0"/>
+                <w:color w:val="2D4DF5"/>
+                <w:sz w:val="14"/>
+              </w:rPr>
+              <w:t xml:space="preserve">◆  </w:t>
+            </w:r>
+            <w:r>
+              <w:rPr>
+                <w:rFonts w:ascii="Schibsted Grotesk" w:hAnsi="Schibsted Grotesk"/>
+                <w:b w:val="0"/>
+                <w:i w:val="0"/>
+                <w:color w:val="5A4F41"/>
+                <w:sz w:val="18"/>
+              </w:rPr>
+              <w:t>Designed, built, and deployed a production SMS gateway (Python / FastAPI on Cloud Run) that lets customers text Tire Rack's TRACI AI agent — inbound webhook → async worker → agent call → replies rendered into SMS via Twilio; backed by Redis/SQS, 42 tests, and keyless CI/CD.</w:t>
+            </w:r>
+          </w:p>
+          <w:p>
+            <w:pPr>
+              <w:spacing w:after="30"/>
+              <w:ind w:left="230" w:hanging="230"/>
+            </w:pPr>
+            <w:r>
+              <w:rPr>
+                <w:rFonts w:ascii="Schibsted Grotesk" w:hAnsi="Schibsted Grotesk"/>
+                <w:b w:val="0"/>
+                <w:i w:val="0"/>
+                <w:color w:val="2D4DF5"/>
+                <w:sz w:val="14"/>
+              </w:rPr>
+              <w:t xml:space="preserve">◆  </w:t>
+            </w:r>
+            <w:r>
+              <w:rPr>
+                <w:rFonts w:ascii="Schibsted Grotesk" w:hAnsi="Schibsted Grotesk"/>
+                <w:b w:val="0"/>
+                <w:i w:val="0"/>
+                <w:color w:val="5A4F41"/>
+                <w:sz w:val="18"/>
+              </w:rPr>
+              <w:t>Cracked its core blocker — the web-only vehicle picker can't render over SMS — with a numbered year/make/model drill-down over the site's YMMV APIs that auto-supplies the factory tire size.</w:t>
+            </w:r>
+          </w:p>
+          <w:p>
+            <w:pPr>
+              <w:spacing w:after="30"/>
+              <w:ind w:left="230" w:hanging="230"/>
+            </w:pPr>
+            <w:r>
+              <w:rPr>
+                <w:rFonts w:ascii="Schibsted Grotesk" w:hAnsi="Schibsted Grotesk"/>
+                <w:b w:val="0"/>
+                <w:i w:val="0"/>
+                <w:color w:val="2D4DF5"/>
+                <w:sz w:val="14"/>
+              </w:rPr>
+              <w:t xml:space="preserve">◆  </w:t>
+            </w:r>
+            <w:r>
+              <w:rPr>
+                <w:rFonts w:ascii="Schibsted Grotesk" w:hAnsi="Schibsted Grotesk"/>
+                <w:b w:val="0"/>
+                <w:i w:val="0"/>
+                <w:color w:val="5A4F41"/>
+                <w:sz w:val="18"/>
+              </w:rPr>
+              <w:t>Built Karst, a Next.js + Firebase caving field-guide app (web + Android) with a privacy-first map — shipped fast with AI-assisted development.</w:t>
+            </w:r>
+          </w:p>
+          <w:p>
+            <w:pPr>
+              <w:spacing w:before="80" w:after="40"/>
             </w:pPr>
             <w:r>
               <w:rPr>
@@ -482,33 +578,7 @@
                 <w:color w:val="5A4F41"/>
                 <w:sz w:val="18"/>
               </w:rPr>
-              <w:t>Resolved open client tickets across virtual, in-office, and in-room appointments.</w:t>
-            </w:r>
-          </w:p>
-          <w:p>
-            <w:pPr>
-              <w:spacing w:after="30"/>
-              <w:ind w:left="230" w:hanging="230"/>
-            </w:pPr>
-            <w:r>
-              <w:rPr>
-                <w:rFonts w:ascii="Schibsted Grotesk" w:hAnsi="Schibsted Grotesk"/>
-                <w:b w:val="0"/>
-                <w:i w:val="0"/>
-                <w:color w:val="2D4DF5"/>
-                <w:sz w:val="14"/>
-              </w:rPr>
-              <w:t xml:space="preserve">◆  </w:t>
-            </w:r>
-            <w:r>
-              <w:rPr>
-                <w:rFonts w:ascii="Schibsted Grotesk" w:hAnsi="Schibsted Grotesk"/>
-                <w:b w:val="0"/>
-                <w:i w:val="0"/>
-                <w:color w:val="5A4F41"/>
-                <w:sz w:val="18"/>
-              </w:rPr>
-              <w:t>Set up wired and wireless connectivity for campus residents.</w:t>
+              <w:t>Resolved client tickets across virtual, in-office, and in-room appointments, and set up wired/wireless connectivity for campus residents.</w:t>
             </w:r>
           </w:p>
           <w:p>
@@ -563,33 +633,7 @@
                 <w:color w:val="5A4F41"/>
                 <w:sz w:val="18"/>
               </w:rPr>
-              <w:t>Troubleshot software and printer issues for a steady stream of walk-in clients.</w:t>
-            </w:r>
-          </w:p>
-          <w:p>
-            <w:pPr>
-              <w:spacing w:after="30"/>
-              <w:ind w:left="230" w:hanging="230"/>
-            </w:pPr>
-            <w:r>
-              <w:rPr>
-                <w:rFonts w:ascii="Schibsted Grotesk" w:hAnsi="Schibsted Grotesk"/>
-                <w:b w:val="0"/>
-                <w:i w:val="0"/>
-                <w:color w:val="2D4DF5"/>
-                <w:sz w:val="14"/>
-              </w:rPr>
-              <w:t xml:space="preserve">◆  </w:t>
-            </w:r>
-            <w:r>
-              <w:rPr>
-                <w:rFonts w:ascii="Schibsted Grotesk" w:hAnsi="Schibsted Grotesk"/>
-                <w:b w:val="0"/>
-                <w:i w:val="0"/>
-                <w:color w:val="5A4F41"/>
-                <w:sz w:val="18"/>
-              </w:rPr>
-              <w:t>Kept lab equipment stocked, organized, and ready to use.</w:t>
+              <w:t>Troubleshot software and printer issues for walk-in clients and kept lab equipment stocked and organized.</w:t>
             </w:r>
           </w:p>
           <w:p>

</xml_diff>

<commit_message>
Résumé docx: back to two columns (one page); lock table to fixed layout
Single-column spilled to two pages; restored the two-column layout that
fits one page. Added a fixed tblLayout + explicit grid so Word honors the
column widths. Theme fonts still embedded (verified 6/6).
</commit_message>
<xml_diff>
--- a/resume/Gabriel-Harlan-Resume.docx
+++ b/resume/Gabriel-Harlan-Resume.docx
@@ -12,7 +12,7 @@
           <w:b/>
           <w:i w:val="0"/>
           <w:color w:val="211B14"/>
-          <w:sz w:val="56"/>
+          <w:sz w:val="60"/>
         </w:rPr>
         <w:t>Gabriel Harlan</w:t>
       </w:r>
@@ -22,7 +22,7 @@
           <w:b/>
           <w:i w:val="0"/>
           <w:color w:val="F4502A"/>
-          <w:sz w:val="56"/>
+          <w:sz w:val="60"/>
         </w:rPr>
         <w:t>.</w:t>
       </w:r>
@@ -37,7 +37,7 @@
           <w:b w:val="0"/>
           <w:i w:val="0"/>
           <w:color w:val="5A4F41"/>
-          <w:sz w:val="18"/>
+          <w:sz w:val="17"/>
         </w:rPr>
         <w:t>Web &amp; UX Designer  ·  Informatics @ Indiana University</w:t>
       </w:r>
@@ -45,9 +45,9 @@
     <w:p>
       <w:pPr>
         <w:pBdr>
-          <w:bottom w:val="single" w:sz="18" w:space="3" w:color="211B14"/>
+          <w:bottom w:val="single" w:sz="18" w:space="4" w:color="211B14"/>
         </w:pBdr>
-        <w:spacing w:after="40"/>
+        <w:spacing w:after="160"/>
       </w:pPr>
       <w:r>
         <w:rPr>
@@ -55,868 +55,974 @@
           <w:b w:val="0"/>
           <w:i w:val="0"/>
           <w:color w:val="211B14"/>
-          <w:sz w:val="17"/>
+          <w:sz w:val="16"/>
         </w:rPr>
-        <w:t>gbharlan@iu.edu  ·  gabrielharlan.is-a.dev  ·  linkedin.com/in/gbharlan  ·  github.com/gabeusgong  ·  Bloomington, IN</w:t>
+        <w:t>gbharlan@iu.edu   ·   gabrielharlan.is-a.dev   ·   linkedin.com/in/gbharlan   ·   github.com/gabeusgong   ·   Bloomington, IN</w:t>
       </w:r>
     </w:p>
-    <w:p>
-      <w:pPr>
-        <w:spacing w:before="220" w:after="80"/>
-        <w:pBdr>
-          <w:bottom w:val="single" w:sz="6" w:space="3" w:color="F4502A"/>
-        </w:pBdr>
-      </w:pPr>
-      <w:r>
-        <w:rPr>
-          <w:rFonts w:ascii="Space Mono" w:hAnsi="Space Mono"/>
-          <w:b/>
-          <w:i w:val="0"/>
-          <w:color w:val="F4502A"/>
-          <w:sz w:val="21"/>
-        </w:rPr>
-        <w:t>EDUCATION</w:t>
-      </w:r>
-    </w:p>
-    <w:p>
-      <w:pPr>
-        <w:tabs>
-          <w:tab w:pos="10224" w:val="right"/>
-        </w:tabs>
-        <w:spacing w:before="100"/>
-      </w:pPr>
-      <w:r>
-        <w:rPr>
-          <w:rFonts w:ascii="Fraunces" w:hAnsi="Fraunces"/>
-          <w:b/>
-          <w:i w:val="0"/>
-          <w:color w:val="211B14"/>
-          <w:sz w:val="24"/>
-        </w:rPr>
-        <w:t>Indiana University</w:t>
-      </w:r>
-      <w:r>
-        <w:rPr>
-          <w:rFonts w:ascii="Space Mono" w:hAnsi="Space Mono"/>
-          <w:b w:val="0"/>
-          <w:i w:val="0"/>
-          <w:color w:val="5A4F41"/>
-          <w:sz w:val="16"/>
-        </w:rPr>
-        <w:tab/>
-        <w:t>Aug 2022 – Dec 2026</w:t>
-      </w:r>
-    </w:p>
-    <w:p>
-      <w:pPr>
-        <w:spacing w:after="0"/>
-      </w:pPr>
-      <w:r>
-        <w:rPr>
-          <w:rFonts w:ascii="Schibsted Grotesk" w:hAnsi="Schibsted Grotesk"/>
-          <w:b w:val="0"/>
-          <w:i/>
-          <w:color w:val="5A4F41"/>
-          <w:sz w:val="19"/>
-        </w:rPr>
-        <w:t>B.S. in Informatics — Minors in Human-Centered Computing &amp; Web Design</w:t>
-      </w:r>
-    </w:p>
-    <w:p>
-      <w:pPr>
-        <w:spacing w:after="0"/>
-      </w:pPr>
-      <w:r>
-        <w:rPr>
-          <w:rFonts w:ascii="Space Mono" w:hAnsi="Space Mono"/>
-          <w:b w:val="0"/>
-          <w:i w:val="0"/>
-          <w:color w:val="5A4F41"/>
-          <w:sz w:val="16"/>
-        </w:rPr>
-        <w:t>Bloomington, Indiana</w:t>
-      </w:r>
-    </w:p>
-    <w:p>
-      <w:pPr>
-        <w:spacing w:before="40" w:after="0"/>
-      </w:pPr>
-      <w:r>
-        <w:rPr>
-          <w:rFonts w:ascii="Space Mono" w:hAnsi="Space Mono"/>
-          <w:b/>
-          <w:i w:val="0"/>
-          <w:color w:val="211B14"/>
-          <w:sz w:val="17"/>
-        </w:rPr>
-        <w:t xml:space="preserve">Coursework:  </w:t>
-      </w:r>
-      <w:r>
-        <w:rPr>
-          <w:rFonts w:ascii="Schibsted Grotesk" w:hAnsi="Schibsted Grotesk"/>
-          <w:b w:val="0"/>
-          <w:i w:val="0"/>
-          <w:color w:val="5A4F41"/>
-          <w:sz w:val="19"/>
-        </w:rPr>
-        <w:t>Human-Computer Interaction &amp; Design · Methods for Human-Centered Computing · Design &amp; Development of an Information System · Web Design · JavaScript · Intro to Cybersecurity · Computer &amp; Information Ethics</w:t>
-      </w:r>
-    </w:p>
-    <w:p>
-      <w:pPr>
-        <w:tabs>
-          <w:tab w:pos="10224" w:val="right"/>
-        </w:tabs>
-        <w:spacing w:before="100"/>
-      </w:pPr>
-      <w:r>
-        <w:rPr>
-          <w:rFonts w:ascii="Fraunces" w:hAnsi="Fraunces"/>
-          <w:b/>
-          <w:i w:val="0"/>
-          <w:color w:val="211B14"/>
-          <w:sz w:val="24"/>
-        </w:rPr>
-        <w:t>Allegan County Area Technical &amp; Education Center</w:t>
-      </w:r>
-      <w:r>
-        <w:rPr>
-          <w:rFonts w:ascii="Space Mono" w:hAnsi="Space Mono"/>
-          <w:b w:val="0"/>
-          <w:i w:val="0"/>
-          <w:color w:val="5A4F41"/>
-          <w:sz w:val="16"/>
-        </w:rPr>
-        <w:tab/>
-        <w:t>Sep 2021 – May 2022</w:t>
-      </w:r>
-    </w:p>
-    <w:p>
-      <w:pPr>
-        <w:spacing w:after="0"/>
-      </w:pPr>
-      <w:r>
-        <w:rPr>
-          <w:rFonts w:ascii="Schibsted Grotesk" w:hAnsi="Schibsted Grotesk"/>
-          <w:b w:val="0"/>
-          <w:i/>
-          <w:color w:val="5A4F41"/>
-          <w:sz w:val="19"/>
-        </w:rPr>
-        <w:t>Computer Information Systems</w:t>
-      </w:r>
-    </w:p>
-    <w:p>
-      <w:pPr>
-        <w:spacing w:after="0"/>
-      </w:pPr>
-      <w:r>
-        <w:rPr>
-          <w:rFonts w:ascii="Space Mono" w:hAnsi="Space Mono"/>
-          <w:b w:val="0"/>
-          <w:i w:val="0"/>
-          <w:color w:val="5A4F41"/>
-          <w:sz w:val="16"/>
-        </w:rPr>
-        <w:t>Allegan, Michigan</w:t>
-      </w:r>
-    </w:p>
-    <w:p>
-      <w:pPr>
-        <w:spacing w:after="50"/>
-        <w:ind w:left="317" w:hanging="317"/>
-      </w:pPr>
-      <w:r>
-        <w:rPr>
-          <w:rFonts w:ascii="Schibsted Grotesk" w:hAnsi="Schibsted Grotesk"/>
-          <w:b/>
-          <w:i w:val="0"/>
-          <w:color w:val="F4502A"/>
-          <w:sz w:val="20"/>
-        </w:rPr>
-        <w:t xml:space="preserve">•  </w:t>
-      </w:r>
-      <w:r>
-        <w:rPr>
-          <w:rFonts w:ascii="Schibsted Grotesk" w:hAnsi="Schibsted Grotesk"/>
-          <w:b w:val="0"/>
-          <w:i w:val="0"/>
-          <w:color w:val="5A4F41"/>
-          <w:sz w:val="20"/>
-        </w:rPr>
-        <w:t>Installed, configured, and administered network infrastructure end-to-end, and built/modified computer hardware, software, and operating systems to spec.</w:t>
-      </w:r>
-    </w:p>
-    <w:p>
-      <w:pPr>
-        <w:spacing w:before="220" w:after="80"/>
-        <w:pBdr>
-          <w:bottom w:val="single" w:sz="6" w:space="3" w:color="2D4DF5"/>
-        </w:pBdr>
-      </w:pPr>
-      <w:r>
-        <w:rPr>
-          <w:rFonts w:ascii="Space Mono" w:hAnsi="Space Mono"/>
-          <w:b/>
-          <w:i w:val="0"/>
-          <w:color w:val="2D4DF5"/>
-          <w:sz w:val="21"/>
-        </w:rPr>
-        <w:t>EXPERIENCE</w:t>
-      </w:r>
-    </w:p>
-    <w:p>
-      <w:pPr>
-        <w:spacing w:before="80" w:after="0"/>
-      </w:pPr>
-      <w:r>
-        <w:rPr>
-          <w:rFonts w:ascii="Space Mono" w:hAnsi="Space Mono"/>
-          <w:b w:val="0"/>
-          <w:i w:val="0"/>
-          <w:color w:val="5A4F41"/>
-          <w:sz w:val="16"/>
-        </w:rPr>
-        <w:t>Tire Rack · South Bend, Indiana (hybrid)</w:t>
-      </w:r>
-    </w:p>
-    <w:p>
-      <w:pPr>
-        <w:tabs>
-          <w:tab w:pos="10224" w:val="right"/>
-        </w:tabs>
-        <w:spacing w:before="100"/>
-      </w:pPr>
-      <w:r>
-        <w:rPr>
-          <w:rFonts w:ascii="Fraunces" w:hAnsi="Fraunces"/>
-          <w:b/>
-          <w:i w:val="0"/>
-          <w:color w:val="211B14"/>
-          <w:sz w:val="24"/>
-        </w:rPr>
-        <w:t>Innovation &amp; AI Intern</w:t>
-      </w:r>
-      <w:r>
-        <w:rPr>
-          <w:rFonts w:ascii="Space Mono" w:hAnsi="Space Mono"/>
-          <w:b w:val="0"/>
-          <w:i w:val="0"/>
-          <w:color w:val="5A4F41"/>
-          <w:sz w:val="16"/>
-        </w:rPr>
-        <w:tab/>
-        <w:t>Jun 2026 – Present</w:t>
-      </w:r>
-    </w:p>
-    <w:p>
-      <w:pPr>
-        <w:spacing w:after="50"/>
-        <w:ind w:left="317" w:hanging="317"/>
-      </w:pPr>
-      <w:r>
-        <w:rPr>
-          <w:rFonts w:ascii="Schibsted Grotesk" w:hAnsi="Schibsted Grotesk"/>
-          <w:b/>
-          <w:i w:val="0"/>
-          <w:color w:val="2D4DF5"/>
-          <w:sz w:val="20"/>
-        </w:rPr>
-        <w:t xml:space="preserve">•  </w:t>
-      </w:r>
-      <w:r>
-        <w:rPr>
-          <w:rFonts w:ascii="Schibsted Grotesk" w:hAnsi="Schibsted Grotesk"/>
-          <w:b w:val="0"/>
-          <w:i w:val="0"/>
-          <w:color w:val="5A4F41"/>
-          <w:sz w:val="20"/>
-        </w:rPr>
-        <w:t>Designed, built, and deployed a production SMS gateway (Python / FastAPI on Cloud Run) that lets customers text Tire Rack's TRACI AI agent — inbound webhook → async worker → agent call → replies rendered into SMS via Twilio; backed by Redis/SQS, 42 tests, and keyless CI/CD.</w:t>
-      </w:r>
-    </w:p>
-    <w:p>
-      <w:pPr>
-        <w:spacing w:after="50"/>
-        <w:ind w:left="317" w:hanging="317"/>
-      </w:pPr>
-      <w:r>
-        <w:rPr>
-          <w:rFonts w:ascii="Schibsted Grotesk" w:hAnsi="Schibsted Grotesk"/>
-          <w:b/>
-          <w:i w:val="0"/>
-          <w:color w:val="2D4DF5"/>
-          <w:sz w:val="20"/>
-        </w:rPr>
-        <w:t xml:space="preserve">•  </w:t>
-      </w:r>
-      <w:r>
-        <w:rPr>
-          <w:rFonts w:ascii="Schibsted Grotesk" w:hAnsi="Schibsted Grotesk"/>
-          <w:b w:val="0"/>
-          <w:i w:val="0"/>
-          <w:color w:val="5A4F41"/>
-          <w:sz w:val="20"/>
-        </w:rPr>
-        <w:t>Cracked its core blocker — the web-only vehicle picker can't render over SMS — with a numbered year/make/model drill-down over the site's YMMV APIs that auto-supplies the factory tire size.</w:t>
-      </w:r>
-    </w:p>
-    <w:p>
-      <w:pPr>
-        <w:spacing w:after="50"/>
-        <w:ind w:left="317" w:hanging="317"/>
-      </w:pPr>
-      <w:r>
-        <w:rPr>
-          <w:rFonts w:ascii="Schibsted Grotesk" w:hAnsi="Schibsted Grotesk"/>
-          <w:b/>
-          <w:i w:val="0"/>
-          <w:color w:val="2D4DF5"/>
-          <w:sz w:val="20"/>
-        </w:rPr>
-        <w:t xml:space="preserve">•  </w:t>
-      </w:r>
-      <w:r>
-        <w:rPr>
-          <w:rFonts w:ascii="Schibsted Grotesk" w:hAnsi="Schibsted Grotesk"/>
-          <w:b w:val="0"/>
-          <w:i w:val="0"/>
-          <w:color w:val="5A4F41"/>
-          <w:sz w:val="20"/>
-        </w:rPr>
-        <w:t>Built Karst, a Next.js + Firebase caving field-guide app (web + Android) with a privacy-first map — shipped fast with AI-assisted development.</w:t>
-      </w:r>
-    </w:p>
-    <w:p>
-      <w:pPr>
-        <w:spacing w:before="80" w:after="0"/>
-      </w:pPr>
-      <w:r>
-        <w:rPr>
-          <w:rFonts w:ascii="Space Mono" w:hAnsi="Space Mono"/>
-          <w:b w:val="0"/>
-          <w:i w:val="0"/>
-          <w:color w:val="5A4F41"/>
-          <w:sz w:val="16"/>
-        </w:rPr>
-        <w:t>University Information Technology Services · Indiana University</w:t>
-      </w:r>
-    </w:p>
-    <w:p>
-      <w:pPr>
-        <w:tabs>
-          <w:tab w:pos="10224" w:val="right"/>
-        </w:tabs>
-        <w:spacing w:before="100"/>
-      </w:pPr>
-      <w:r>
-        <w:rPr>
-          <w:rFonts w:ascii="Fraunces" w:hAnsi="Fraunces"/>
-          <w:b/>
-          <w:i w:val="0"/>
-          <w:color w:val="211B14"/>
-          <w:sz w:val="24"/>
-        </w:rPr>
-        <w:t>SCIPS Consultant Supervisor</w:t>
-      </w:r>
-      <w:r>
-        <w:rPr>
-          <w:rFonts w:ascii="Space Mono" w:hAnsi="Space Mono"/>
-          <w:b w:val="0"/>
-          <w:i w:val="0"/>
-          <w:color w:val="5A4F41"/>
-          <w:sz w:val="16"/>
-        </w:rPr>
-        <w:tab/>
-        <w:t>Aug 2024 – Feb 2026</w:t>
-      </w:r>
-    </w:p>
-    <w:p>
-      <w:pPr>
-        <w:spacing w:after="50"/>
-        <w:ind w:left="317" w:hanging="317"/>
-      </w:pPr>
-      <w:r>
-        <w:rPr>
-          <w:rFonts w:ascii="Schibsted Grotesk" w:hAnsi="Schibsted Grotesk"/>
-          <w:b/>
-          <w:i w:val="0"/>
-          <w:color w:val="2D4DF5"/>
-          <w:sz w:val="20"/>
-        </w:rPr>
-        <w:t xml:space="preserve">•  </w:t>
-      </w:r>
-      <w:r>
-        <w:rPr>
-          <w:rFonts w:ascii="Schibsted Grotesk" w:hAnsi="Schibsted Grotesk"/>
-          <w:b w:val="0"/>
-          <w:i w:val="0"/>
-          <w:color w:val="5A4F41"/>
-          <w:sz w:val="20"/>
-        </w:rPr>
-        <w:t>Led the Tech Team and walk-in Support Center, coaching consultants through complex technical and customer issues.</w:t>
-      </w:r>
-    </w:p>
-    <w:p>
-      <w:pPr>
-        <w:spacing w:after="50"/>
-        <w:ind w:left="317" w:hanging="317"/>
-      </w:pPr>
-      <w:r>
-        <w:rPr>
-          <w:rFonts w:ascii="Schibsted Grotesk" w:hAnsi="Schibsted Grotesk"/>
-          <w:b/>
-          <w:i w:val="0"/>
-          <w:color w:val="2D4DF5"/>
-          <w:sz w:val="20"/>
-        </w:rPr>
-        <w:t xml:space="preserve">•  </w:t>
-      </w:r>
-      <w:r>
-        <w:rPr>
-          <w:rFonts w:ascii="Schibsted Grotesk" w:hAnsi="Schibsted Grotesk"/>
-          <w:b w:val="0"/>
-          <w:i w:val="0"/>
-          <w:color w:val="5A4F41"/>
-          <w:sz w:val="20"/>
-        </w:rPr>
-        <w:t>Drove campus-wide support for labs, printers, and classroom tech — from preemptive checks to urgent in-person requests.</w:t>
-      </w:r>
-    </w:p>
-    <w:p>
-      <w:pPr>
-        <w:tabs>
-          <w:tab w:pos="10224" w:val="right"/>
-        </w:tabs>
-        <w:spacing w:before="100"/>
-      </w:pPr>
-      <w:r>
-        <w:rPr>
-          <w:rFonts w:ascii="Fraunces" w:hAnsi="Fraunces"/>
-          <w:b/>
-          <w:i w:val="0"/>
-          <w:color w:val="211B14"/>
-          <w:sz w:val="24"/>
-        </w:rPr>
-        <w:t>TCC Tech Team</w:t>
-      </w:r>
-      <w:r>
-        <w:rPr>
-          <w:rFonts w:ascii="Space Mono" w:hAnsi="Space Mono"/>
-          <w:b w:val="0"/>
-          <w:i w:val="0"/>
-          <w:color w:val="5A4F41"/>
-          <w:sz w:val="16"/>
-        </w:rPr>
-        <w:tab/>
-        <w:t>Nov 2023 – May 2024</w:t>
-      </w:r>
-    </w:p>
-    <w:p>
-      <w:pPr>
-        <w:spacing w:after="50"/>
-        <w:ind w:left="317" w:hanging="317"/>
-      </w:pPr>
-      <w:r>
-        <w:rPr>
-          <w:rFonts w:ascii="Schibsted Grotesk" w:hAnsi="Schibsted Grotesk"/>
-          <w:b/>
-          <w:i w:val="0"/>
-          <w:color w:val="2D4DF5"/>
-          <w:sz w:val="20"/>
-        </w:rPr>
-        <w:t xml:space="preserve">•  </w:t>
-      </w:r>
-      <w:r>
-        <w:rPr>
-          <w:rFonts w:ascii="Schibsted Grotesk" w:hAnsi="Schibsted Grotesk"/>
-          <w:b w:val="0"/>
-          <w:i w:val="0"/>
-          <w:color w:val="5A4F41"/>
-          <w:sz w:val="20"/>
-        </w:rPr>
-        <w:t>Resolved client tickets across virtual, in-office, and in-room appointments, and set up wired/wireless connectivity for campus residents.</w:t>
-      </w:r>
-    </w:p>
-    <w:p>
-      <w:pPr>
-        <w:tabs>
-          <w:tab w:pos="10224" w:val="right"/>
-        </w:tabs>
-        <w:spacing w:before="100"/>
-      </w:pPr>
-      <w:r>
-        <w:rPr>
-          <w:rFonts w:ascii="Fraunces" w:hAnsi="Fraunces"/>
-          <w:b/>
-          <w:i w:val="0"/>
-          <w:color w:val="211B14"/>
-          <w:sz w:val="24"/>
-        </w:rPr>
-        <w:t>Technology Center Consultant</w:t>
-      </w:r>
-      <w:r>
-        <w:rPr>
-          <w:rFonts w:ascii="Space Mono" w:hAnsi="Space Mono"/>
-          <w:b w:val="0"/>
-          <w:i w:val="0"/>
-          <w:color w:val="5A4F41"/>
-          <w:sz w:val="16"/>
-        </w:rPr>
-        <w:tab/>
-        <w:t>Sep 2023 – Nov 2023</w:t>
-      </w:r>
-    </w:p>
-    <w:p>
-      <w:pPr>
-        <w:spacing w:after="50"/>
-        <w:ind w:left="317" w:hanging="317"/>
-      </w:pPr>
-      <w:r>
-        <w:rPr>
-          <w:rFonts w:ascii="Schibsted Grotesk" w:hAnsi="Schibsted Grotesk"/>
-          <w:b/>
-          <w:i w:val="0"/>
-          <w:color w:val="2D4DF5"/>
-          <w:sz w:val="20"/>
-        </w:rPr>
-        <w:t xml:space="preserve">•  </w:t>
-      </w:r>
-      <w:r>
-        <w:rPr>
-          <w:rFonts w:ascii="Schibsted Grotesk" w:hAnsi="Schibsted Grotesk"/>
-          <w:b w:val="0"/>
-          <w:i w:val="0"/>
-          <w:color w:val="5A4F41"/>
-          <w:sz w:val="20"/>
-        </w:rPr>
-        <w:t>Troubleshot software and printer issues for walk-in clients and kept lab equipment stocked and organized.</w:t>
-      </w:r>
-    </w:p>
-    <w:p>
-      <w:pPr>
-        <w:spacing w:after="50"/>
-        <w:ind w:left="317" w:hanging="317"/>
-      </w:pPr>
-      <w:r>
-        <w:rPr>
-          <w:rFonts w:ascii="Schibsted Grotesk" w:hAnsi="Schibsted Grotesk"/>
-          <w:b/>
-          <w:i w:val="0"/>
-          <w:color w:val="2D4DF5"/>
-          <w:sz w:val="20"/>
-        </w:rPr>
-        <w:t xml:space="preserve">•  </w:t>
-      </w:r>
-      <w:r>
-        <w:rPr>
-          <w:rFonts w:ascii="Schibsted Grotesk" w:hAnsi="Schibsted Grotesk"/>
-          <w:b w:val="0"/>
-          <w:i w:val="0"/>
-          <w:color w:val="5A4F41"/>
-          <w:sz w:val="20"/>
-        </w:rPr>
-        <w:t>Logged and tracked issues in ticketing systems, producing customer and lab reports.</w:t>
-      </w:r>
-    </w:p>
-    <w:p>
-      <w:pPr>
-        <w:spacing w:before="220" w:after="80"/>
-        <w:pBdr>
-          <w:bottom w:val="single" w:sz="6" w:space="3" w:color="C08800"/>
-        </w:pBdr>
-      </w:pPr>
-      <w:r>
-        <w:rPr>
-          <w:rFonts w:ascii="Space Mono" w:hAnsi="Space Mono"/>
-          <w:b/>
-          <w:i w:val="0"/>
-          <w:color w:val="C08800"/>
-          <w:sz w:val="21"/>
-        </w:rPr>
-        <w:t>SKILLS</w:t>
-      </w:r>
-    </w:p>
-    <w:p>
-      <w:pPr>
-        <w:spacing w:after="40"/>
-      </w:pPr>
-      <w:r>
-        <w:rPr>
-          <w:rFonts w:ascii="Space Mono" w:hAnsi="Space Mono"/>
-          <w:b/>
-          <w:i w:val="0"/>
-          <w:color w:val="211B14"/>
-          <w:sz w:val="17"/>
-        </w:rPr>
-        <w:t xml:space="preserve">Languages:  </w:t>
-      </w:r>
-      <w:r>
-        <w:rPr>
-          <w:rFonts w:ascii="Schibsted Grotesk" w:hAnsi="Schibsted Grotesk"/>
-          <w:b w:val="0"/>
-          <w:i w:val="0"/>
-          <w:color w:val="5A4F41"/>
-          <w:sz w:val="20"/>
-        </w:rPr>
-        <w:t>JavaScript, Python, PHP, MySQL</w:t>
-      </w:r>
-    </w:p>
-    <w:p>
-      <w:pPr>
-        <w:spacing w:after="40"/>
-      </w:pPr>
-      <w:r>
-        <w:rPr>
-          <w:rFonts w:ascii="Space Mono" w:hAnsi="Space Mono"/>
-          <w:b/>
-          <w:i w:val="0"/>
-          <w:color w:val="211B14"/>
-          <w:sz w:val="17"/>
-        </w:rPr>
-        <w:t xml:space="preserve">Web &amp; Frameworks:  </w:t>
-      </w:r>
-      <w:r>
-        <w:rPr>
-          <w:rFonts w:ascii="Schibsted Grotesk" w:hAnsi="Schibsted Grotesk"/>
-          <w:b w:val="0"/>
-          <w:i w:val="0"/>
-          <w:color w:val="5A4F41"/>
-          <w:sz w:val="20"/>
-        </w:rPr>
-        <w:t>React / Next.js, HTML, CSS, Firebase, Git</w:t>
-      </w:r>
-    </w:p>
-    <w:p>
-      <w:pPr>
-        <w:spacing w:after="40"/>
-      </w:pPr>
-      <w:r>
-        <w:rPr>
-          <w:rFonts w:ascii="Space Mono" w:hAnsi="Space Mono"/>
-          <w:b/>
-          <w:i w:val="0"/>
-          <w:color w:val="211B14"/>
-          <w:sz w:val="17"/>
-        </w:rPr>
-        <w:t xml:space="preserve">Design:  </w:t>
-      </w:r>
-      <w:r>
-        <w:rPr>
-          <w:rFonts w:ascii="Schibsted Grotesk" w:hAnsi="Schibsted Grotesk"/>
-          <w:b w:val="0"/>
-          <w:i w:val="0"/>
-          <w:color w:val="5A4F41"/>
-          <w:sz w:val="20"/>
-        </w:rPr>
-        <w:t>Figma, UX &amp; HCI Design, Web Design, Tableau</w:t>
-      </w:r>
-    </w:p>
-    <w:p>
-      <w:pPr>
-        <w:spacing w:after="40"/>
-      </w:pPr>
-      <w:r>
-        <w:rPr>
-          <w:rFonts w:ascii="Space Mono" w:hAnsi="Space Mono"/>
-          <w:b/>
-          <w:i w:val="0"/>
-          <w:color w:val="211B14"/>
-          <w:sz w:val="17"/>
-        </w:rPr>
-        <w:t xml:space="preserve">Operating Systems:  </w:t>
-      </w:r>
-      <w:r>
-        <w:rPr>
-          <w:rFonts w:ascii="Schibsted Grotesk" w:hAnsi="Schibsted Grotesk"/>
-          <w:b w:val="0"/>
-          <w:i w:val="0"/>
-          <w:color w:val="5A4F41"/>
-          <w:sz w:val="20"/>
-        </w:rPr>
-        <w:t>Linux, macOS, Windows 10/11, Windows Server</w:t>
-      </w:r>
-    </w:p>
-    <w:p>
-      <w:pPr>
-        <w:spacing w:after="40"/>
-      </w:pPr>
-      <w:r>
-        <w:rPr>
-          <w:rFonts w:ascii="Space Mono" w:hAnsi="Space Mono"/>
-          <w:b/>
-          <w:i w:val="0"/>
-          <w:color w:val="211B14"/>
-          <w:sz w:val="17"/>
-        </w:rPr>
-        <w:t xml:space="preserve">Tools:  </w:t>
-      </w:r>
-      <w:r>
-        <w:rPr>
-          <w:rFonts w:ascii="Schibsted Grotesk" w:hAnsi="Schibsted Grotesk"/>
-          <w:b w:val="0"/>
-          <w:i w:val="0"/>
-          <w:color w:val="5A4F41"/>
-          <w:sz w:val="20"/>
-        </w:rPr>
-        <w:t>Active Directory, Office365, VirtualBox, VMware, VS Code, WSL</w:t>
-      </w:r>
-    </w:p>
-    <w:p>
-      <w:pPr>
-        <w:spacing w:before="220" w:after="80"/>
-        <w:pBdr>
-          <w:bottom w:val="single" w:sz="6" w:space="3" w:color="82990A"/>
-        </w:pBdr>
-      </w:pPr>
-      <w:r>
-        <w:rPr>
-          <w:rFonts w:ascii="Space Mono" w:hAnsi="Space Mono"/>
-          <w:b/>
-          <w:i w:val="0"/>
-          <w:color w:val="82990A"/>
-          <w:sz w:val="21"/>
-        </w:rPr>
-        <w:t>CERTIFICATIONS</w:t>
-      </w:r>
-    </w:p>
-    <w:p>
-      <w:pPr>
-        <w:spacing w:after="50"/>
-        <w:ind w:left="317" w:hanging="317"/>
-      </w:pPr>
-      <w:r>
-        <w:rPr>
-          <w:rFonts w:ascii="Schibsted Grotesk" w:hAnsi="Schibsted Grotesk"/>
-          <w:b/>
-          <w:i w:val="0"/>
-          <w:color w:val="82990A"/>
-          <w:sz w:val="20"/>
-        </w:rPr>
-        <w:t xml:space="preserve">•  </w:t>
-      </w:r>
-      <w:r>
-        <w:rPr>
-          <w:rFonts w:ascii="Schibsted Grotesk" w:hAnsi="Schibsted Grotesk"/>
-          <w:b w:val="0"/>
-          <w:i w:val="0"/>
-          <w:color w:val="5A4F41"/>
-          <w:sz w:val="20"/>
-        </w:rPr>
-        <w:t>Certiport ITS — Computational Thinking, Cybersecurity, Device Configuration &amp; Management, Network Security &amp; Networking</w:t>
-      </w:r>
-    </w:p>
-    <w:p>
-      <w:pPr>
-        <w:spacing w:after="50"/>
-        <w:ind w:left="317" w:hanging="317"/>
-      </w:pPr>
-      <w:r>
-        <w:rPr>
-          <w:rFonts w:ascii="Schibsted Grotesk" w:hAnsi="Schibsted Grotesk"/>
-          <w:b/>
-          <w:i w:val="0"/>
-          <w:color w:val="82990A"/>
-          <w:sz w:val="20"/>
-        </w:rPr>
-        <w:t xml:space="preserve">•  </w:t>
-      </w:r>
-      <w:r>
-        <w:rPr>
-          <w:rFonts w:ascii="Schibsted Grotesk" w:hAnsi="Schibsted Grotesk"/>
-          <w:b w:val="0"/>
-          <w:i w:val="0"/>
-          <w:color w:val="5A4F41"/>
-          <w:sz w:val="20"/>
-        </w:rPr>
-        <w:t>Cisco Certified Support Technician — Cybersecurity</w:t>
-      </w:r>
-    </w:p>
-    <w:p>
-      <w:pPr>
-        <w:spacing w:after="50"/>
-        <w:ind w:left="317" w:hanging="317"/>
-      </w:pPr>
-      <w:r>
-        <w:rPr>
-          <w:rFonts w:ascii="Schibsted Grotesk" w:hAnsi="Schibsted Grotesk"/>
-          <w:b/>
-          <w:i w:val="0"/>
-          <w:color w:val="82990A"/>
-          <w:sz w:val="20"/>
-        </w:rPr>
-        <w:t xml:space="preserve">•  </w:t>
-      </w:r>
-      <w:r>
-        <w:rPr>
-          <w:rFonts w:ascii="Schibsted Grotesk" w:hAnsi="Schibsted Grotesk"/>
-          <w:b w:val="0"/>
-          <w:i w:val="0"/>
-          <w:color w:val="5A4F41"/>
-          <w:sz w:val="20"/>
-        </w:rPr>
-        <w:t>Cisco IT Essentials</w:t>
-      </w:r>
-    </w:p>
-    <w:p>
-      <w:pPr>
-        <w:spacing w:after="50"/>
-        <w:ind w:left="317" w:hanging="317"/>
-      </w:pPr>
-      <w:r>
-        <w:rPr>
-          <w:rFonts w:ascii="Schibsted Grotesk" w:hAnsi="Schibsted Grotesk"/>
-          <w:b/>
-          <w:i w:val="0"/>
-          <w:color w:val="82990A"/>
-          <w:sz w:val="20"/>
-        </w:rPr>
-        <w:t xml:space="preserve">•  </w:t>
-      </w:r>
-      <w:r>
-        <w:rPr>
-          <w:rFonts w:ascii="Schibsted Grotesk" w:hAnsi="Schibsted Grotesk"/>
-          <w:b w:val="0"/>
-          <w:i w:val="0"/>
-          <w:color w:val="5A4F41"/>
-          <w:sz w:val="20"/>
-        </w:rPr>
-        <w:t>TestOut PC Pro</w:t>
-      </w:r>
-    </w:p>
-    <w:p>
-      <w:pPr>
-        <w:spacing w:before="220" w:after="80"/>
-        <w:pBdr>
-          <w:bottom w:val="single" w:sz="6" w:space="3" w:color="D8539B"/>
-        </w:pBdr>
-      </w:pPr>
-      <w:r>
-        <w:rPr>
-          <w:rFonts w:ascii="Space Mono" w:hAnsi="Space Mono"/>
-          <w:b/>
-          <w:i w:val="0"/>
-          <w:color w:val="D8539B"/>
-          <w:sz w:val="21"/>
-        </w:rPr>
-        <w:t>OFF THE CLOCK</w:t>
-      </w:r>
-    </w:p>
-    <w:p>
-      <w:r>
-        <w:rPr>
-          <w:rFonts w:ascii="Schibsted Grotesk" w:hAnsi="Schibsted Grotesk"/>
-          <w:b w:val="0"/>
-          <w:i w:val="0"/>
-          <w:color w:val="5A4F41"/>
-          <w:sz w:val="19"/>
-        </w:rPr>
-        <w:t>Caving · Coffee · Gym · Hiking · PC building · Custom keyboards · Plants · Reading · Swimming</w:t>
-      </w:r>
-    </w:p>
+    <w:tbl>
+      <w:tblPr>
+        <w:tblW w:type="auto" w:w="0"/>
+        <w:jc w:val="left"/>
+        <w:tblLook w:firstColumn="1" w:firstRow="1" w:lastColumn="0" w:lastRow="0" w:noHBand="0" w:noVBand="1" w:val="04A0"/>
+        <w:tblBorders>
+          <w:top w:val="none"/>
+          <w:left w:val="none"/>
+          <w:bottom w:val="none"/>
+          <w:right w:val="none"/>
+          <w:insideH w:val="none"/>
+          <w:insideV w:val="none"/>
+        </w:tblBorders>
+        <w:tblLayout w:type="fixed"/>
+        <w:tblW w:w="10512" w:type="dxa"/>
+      </w:tblPr>
+      <w:tblGrid>
+        <w:gridCol w:w="6552"/>
+        <w:gridCol w:w="3960"/>
+      </w:tblGrid>
+      <w:tr>
+        <w:tc>
+          <w:tcPr>
+            <w:tcW w:type="dxa" w:w="6552"/>
+            <w:tcMar>
+              <w:top w:w="0" w:type="dxa"/>
+              <w:start w:w="0" w:type="dxa"/>
+              <w:bottom w:w="0" w:type="dxa"/>
+              <w:end w:w="170" w:type="dxa"/>
+            </w:tcMar>
+          </w:tcPr>
+          <w:p>
+            <w:pPr>
+              <w:spacing w:before="180" w:after="60"/>
+            </w:pPr>
+            <w:r>
+              <w:rPr>
+                <w:rFonts w:ascii="Space Mono" w:hAnsi="Space Mono"/>
+                <w:b/>
+                <w:i w:val="0"/>
+                <w:color w:val="F4502A"/>
+                <w:sz w:val="18"/>
+              </w:rPr>
+              <w:t xml:space="preserve">■ </w:t>
+            </w:r>
+            <w:r>
+              <w:rPr>
+                <w:rFonts w:ascii="Space Mono" w:hAnsi="Space Mono"/>
+                <w:b/>
+                <w:i w:val="0"/>
+                <w:color w:val="211B14"/>
+                <w:sz w:val="18"/>
+              </w:rPr>
+              <w:t>EDUCATION</w:t>
+            </w:r>
+          </w:p>
+          <w:p>
+            <w:pPr>
+              <w:tabs>
+                <w:tab w:pos="6235" w:val="right"/>
+              </w:tabs>
+              <w:spacing w:before="80"/>
+            </w:pPr>
+            <w:r>
+              <w:rPr>
+                <w:rFonts w:ascii="Fraunces" w:hAnsi="Fraunces"/>
+                <w:b/>
+                <w:i w:val="0"/>
+                <w:color w:val="211B14"/>
+                <w:sz w:val="22"/>
+              </w:rPr>
+              <w:t>Indiana University</w:t>
+            </w:r>
+            <w:r>
+              <w:rPr>
+                <w:rFonts w:ascii="Space Mono" w:hAnsi="Space Mono"/>
+                <w:b w:val="0"/>
+                <w:i w:val="0"/>
+                <w:color w:val="5A4F41"/>
+                <w:sz w:val="15"/>
+              </w:rPr>
+              <w:tab/>
+              <w:t>Aug 2022 – Dec 2026</w:t>
+            </w:r>
+          </w:p>
+          <w:p>
+            <w:pPr>
+              <w:spacing w:after="0"/>
+            </w:pPr>
+            <w:r>
+              <w:rPr>
+                <w:rFonts w:ascii="Schibsted Grotesk" w:hAnsi="Schibsted Grotesk"/>
+                <w:b w:val="0"/>
+                <w:i/>
+                <w:color w:val="5A4F41"/>
+                <w:sz w:val="18"/>
+              </w:rPr>
+              <w:t>B.S. in Informatics — Minors in Human-Centered Computing &amp; Web Design</w:t>
+            </w:r>
+          </w:p>
+          <w:p>
+            <w:pPr>
+              <w:spacing w:after="0"/>
+            </w:pPr>
+            <w:r>
+              <w:rPr>
+                <w:rFonts w:ascii="Space Mono" w:hAnsi="Space Mono"/>
+                <w:b w:val="0"/>
+                <w:i w:val="0"/>
+                <w:color w:val="5A4F41"/>
+                <w:sz w:val="15"/>
+              </w:rPr>
+              <w:t>Bloomington, Indiana</w:t>
+            </w:r>
+          </w:p>
+          <w:p>
+            <w:pPr>
+              <w:spacing w:before="40"/>
+            </w:pPr>
+            <w:r>
+              <w:rPr>
+                <w:rFonts w:ascii="Space Mono" w:hAnsi="Space Mono"/>
+                <w:b/>
+                <w:i w:val="0"/>
+                <w:color w:val="211B14"/>
+                <w:sz w:val="15"/>
+              </w:rPr>
+              <w:t xml:space="preserve">Coursework  </w:t>
+            </w:r>
+            <w:r>
+              <w:rPr>
+                <w:rFonts w:ascii="Schibsted Grotesk" w:hAnsi="Schibsted Grotesk"/>
+                <w:b w:val="0"/>
+                <w:i w:val="0"/>
+                <w:color w:val="5A4F41"/>
+                <w:sz w:val="17"/>
+              </w:rPr>
+              <w:t>Human-Computer Interaction &amp; Design · Methods for Human-Centered Computing · Design &amp; Development of an Information System · Web Design · JavaScript · Intro to Cybersecurity · Computer &amp; Information Ethics</w:t>
+            </w:r>
+          </w:p>
+          <w:p>
+            <w:pPr>
+              <w:tabs>
+                <w:tab w:pos="6235" w:val="right"/>
+              </w:tabs>
+              <w:spacing w:before="80"/>
+            </w:pPr>
+            <w:r>
+              <w:rPr>
+                <w:rFonts w:ascii="Fraunces" w:hAnsi="Fraunces"/>
+                <w:b/>
+                <w:i w:val="0"/>
+                <w:color w:val="211B14"/>
+                <w:sz w:val="22"/>
+              </w:rPr>
+              <w:t>Allegan County Area Technical &amp; Education Center</w:t>
+            </w:r>
+            <w:r>
+              <w:rPr>
+                <w:rFonts w:ascii="Space Mono" w:hAnsi="Space Mono"/>
+                <w:b w:val="0"/>
+                <w:i w:val="0"/>
+                <w:color w:val="5A4F41"/>
+                <w:sz w:val="15"/>
+              </w:rPr>
+              <w:tab/>
+              <w:t>Sep 2021 – May 2022</w:t>
+            </w:r>
+          </w:p>
+          <w:p>
+            <w:pPr>
+              <w:spacing w:after="0"/>
+            </w:pPr>
+            <w:r>
+              <w:rPr>
+                <w:rFonts w:ascii="Schibsted Grotesk" w:hAnsi="Schibsted Grotesk"/>
+                <w:b w:val="0"/>
+                <w:i/>
+                <w:color w:val="5A4F41"/>
+                <w:sz w:val="18"/>
+              </w:rPr>
+              <w:t>Computer Information Systems</w:t>
+            </w:r>
+          </w:p>
+          <w:p>
+            <w:pPr>
+              <w:spacing w:after="0"/>
+            </w:pPr>
+            <w:r>
+              <w:rPr>
+                <w:rFonts w:ascii="Space Mono" w:hAnsi="Space Mono"/>
+                <w:b w:val="0"/>
+                <w:i w:val="0"/>
+                <w:color w:val="5A4F41"/>
+                <w:sz w:val="15"/>
+              </w:rPr>
+              <w:t>Allegan, Michigan</w:t>
+            </w:r>
+          </w:p>
+          <w:p>
+            <w:pPr>
+              <w:spacing w:after="30"/>
+              <w:ind w:left="230" w:hanging="230"/>
+            </w:pPr>
+            <w:r>
+              <w:rPr>
+                <w:rFonts w:ascii="Schibsted Grotesk" w:hAnsi="Schibsted Grotesk"/>
+                <w:b w:val="0"/>
+                <w:i w:val="0"/>
+                <w:color w:val="F4502A"/>
+                <w:sz w:val="14"/>
+              </w:rPr>
+              <w:t xml:space="preserve">◆  </w:t>
+            </w:r>
+            <w:r>
+              <w:rPr>
+                <w:rFonts w:ascii="Schibsted Grotesk" w:hAnsi="Schibsted Grotesk"/>
+                <w:b w:val="0"/>
+                <w:i w:val="0"/>
+                <w:color w:val="5A4F41"/>
+                <w:sz w:val="18"/>
+              </w:rPr>
+              <w:t>Installed, configured, and administered network infrastructure end-to-end, and built/modified computer hardware, software, and operating systems to spec.</w:t>
+            </w:r>
+          </w:p>
+          <w:p>
+            <w:pPr>
+              <w:spacing w:before="180" w:after="60"/>
+            </w:pPr>
+            <w:r>
+              <w:rPr>
+                <w:rFonts w:ascii="Space Mono" w:hAnsi="Space Mono"/>
+                <w:b/>
+                <w:i w:val="0"/>
+                <w:color w:val="2D4DF5"/>
+                <w:sz w:val="18"/>
+              </w:rPr>
+              <w:t xml:space="preserve">■ </w:t>
+            </w:r>
+            <w:r>
+              <w:rPr>
+                <w:rFonts w:ascii="Space Mono" w:hAnsi="Space Mono"/>
+                <w:b/>
+                <w:i w:val="0"/>
+                <w:color w:val="211B14"/>
+                <w:sz w:val="18"/>
+              </w:rPr>
+              <w:t>EXPERIENCE</w:t>
+            </w:r>
+          </w:p>
+          <w:p>
+            <w:pPr>
+              <w:spacing w:before="80" w:after="40"/>
+            </w:pPr>
+            <w:r>
+              <w:rPr>
+                <w:rFonts w:ascii="Space Mono" w:hAnsi="Space Mono"/>
+                <w:b w:val="0"/>
+                <w:i w:val="0"/>
+                <w:color w:val="5A4F41"/>
+                <w:sz w:val="15"/>
+              </w:rPr>
+              <w:t>Tire Rack · South Bend, Indiana (hybrid)</w:t>
+            </w:r>
+          </w:p>
+          <w:p>
+            <w:pPr>
+              <w:tabs>
+                <w:tab w:pos="6235" w:val="right"/>
+              </w:tabs>
+              <w:spacing w:before="80"/>
+            </w:pPr>
+            <w:r>
+              <w:rPr>
+                <w:rFonts w:ascii="Fraunces" w:hAnsi="Fraunces"/>
+                <w:b/>
+                <w:i w:val="0"/>
+                <w:color w:val="211B14"/>
+                <w:sz w:val="22"/>
+              </w:rPr>
+              <w:t>Innovation &amp; AI Intern</w:t>
+            </w:r>
+            <w:r>
+              <w:rPr>
+                <w:rFonts w:ascii="Space Mono" w:hAnsi="Space Mono"/>
+                <w:b w:val="0"/>
+                <w:i w:val="0"/>
+                <w:color w:val="5A4F41"/>
+                <w:sz w:val="15"/>
+              </w:rPr>
+              <w:tab/>
+              <w:t>Jun 2026 – Present</w:t>
+            </w:r>
+          </w:p>
+          <w:p>
+            <w:pPr>
+              <w:spacing w:after="30"/>
+              <w:ind w:left="230" w:hanging="230"/>
+            </w:pPr>
+            <w:r>
+              <w:rPr>
+                <w:rFonts w:ascii="Schibsted Grotesk" w:hAnsi="Schibsted Grotesk"/>
+                <w:b w:val="0"/>
+                <w:i w:val="0"/>
+                <w:color w:val="2D4DF5"/>
+                <w:sz w:val="14"/>
+              </w:rPr>
+              <w:t xml:space="preserve">◆  </w:t>
+            </w:r>
+            <w:r>
+              <w:rPr>
+                <w:rFonts w:ascii="Schibsted Grotesk" w:hAnsi="Schibsted Grotesk"/>
+                <w:b w:val="0"/>
+                <w:i w:val="0"/>
+                <w:color w:val="5A4F41"/>
+                <w:sz w:val="18"/>
+              </w:rPr>
+              <w:t>Designed, built, and deployed a production SMS gateway (Python / FastAPI on Cloud Run) that lets customers text Tire Rack's TRACI AI agent — inbound webhook → async worker → agent call → replies rendered into SMS via Twilio; backed by Redis/SQS, 42 tests, and keyless CI/CD.</w:t>
+            </w:r>
+          </w:p>
+          <w:p>
+            <w:pPr>
+              <w:spacing w:after="30"/>
+              <w:ind w:left="230" w:hanging="230"/>
+            </w:pPr>
+            <w:r>
+              <w:rPr>
+                <w:rFonts w:ascii="Schibsted Grotesk" w:hAnsi="Schibsted Grotesk"/>
+                <w:b w:val="0"/>
+                <w:i w:val="0"/>
+                <w:color w:val="2D4DF5"/>
+                <w:sz w:val="14"/>
+              </w:rPr>
+              <w:t xml:space="preserve">◆  </w:t>
+            </w:r>
+            <w:r>
+              <w:rPr>
+                <w:rFonts w:ascii="Schibsted Grotesk" w:hAnsi="Schibsted Grotesk"/>
+                <w:b w:val="0"/>
+                <w:i w:val="0"/>
+                <w:color w:val="5A4F41"/>
+                <w:sz w:val="18"/>
+              </w:rPr>
+              <w:t>Cracked its core blocker — the web-only vehicle picker can't render over SMS — with a numbered year/make/model drill-down over the site's YMMV APIs that auto-supplies the factory tire size.</w:t>
+            </w:r>
+          </w:p>
+          <w:p>
+            <w:pPr>
+              <w:spacing w:after="30"/>
+              <w:ind w:left="230" w:hanging="230"/>
+            </w:pPr>
+            <w:r>
+              <w:rPr>
+                <w:rFonts w:ascii="Schibsted Grotesk" w:hAnsi="Schibsted Grotesk"/>
+                <w:b w:val="0"/>
+                <w:i w:val="0"/>
+                <w:color w:val="2D4DF5"/>
+                <w:sz w:val="14"/>
+              </w:rPr>
+              <w:t xml:space="preserve">◆  </w:t>
+            </w:r>
+            <w:r>
+              <w:rPr>
+                <w:rFonts w:ascii="Schibsted Grotesk" w:hAnsi="Schibsted Grotesk"/>
+                <w:b w:val="0"/>
+                <w:i w:val="0"/>
+                <w:color w:val="5A4F41"/>
+                <w:sz w:val="18"/>
+              </w:rPr>
+              <w:t>Built Karst, a Next.js + Firebase caving field-guide app (web + Android) with a privacy-first map — shipped fast with AI-assisted development.</w:t>
+            </w:r>
+          </w:p>
+          <w:p>
+            <w:pPr>
+              <w:spacing w:before="80" w:after="40"/>
+            </w:pPr>
+            <w:r>
+              <w:rPr>
+                <w:rFonts w:ascii="Space Mono" w:hAnsi="Space Mono"/>
+                <w:b w:val="0"/>
+                <w:i w:val="0"/>
+                <w:color w:val="5A4F41"/>
+                <w:sz w:val="15"/>
+              </w:rPr>
+              <w:t>University Information Technology Services · Indiana University</w:t>
+            </w:r>
+          </w:p>
+          <w:p>
+            <w:pPr>
+              <w:tabs>
+                <w:tab w:pos="6235" w:val="right"/>
+              </w:tabs>
+              <w:spacing w:before="80"/>
+            </w:pPr>
+            <w:r>
+              <w:rPr>
+                <w:rFonts w:ascii="Fraunces" w:hAnsi="Fraunces"/>
+                <w:b/>
+                <w:i w:val="0"/>
+                <w:color w:val="211B14"/>
+                <w:sz w:val="22"/>
+              </w:rPr>
+              <w:t>SCIPS Consultant Supervisor</w:t>
+            </w:r>
+            <w:r>
+              <w:rPr>
+                <w:rFonts w:ascii="Space Mono" w:hAnsi="Space Mono"/>
+                <w:b w:val="0"/>
+                <w:i w:val="0"/>
+                <w:color w:val="5A4F41"/>
+                <w:sz w:val="15"/>
+              </w:rPr>
+              <w:tab/>
+              <w:t>Aug 2024 – Feb 2026</w:t>
+            </w:r>
+          </w:p>
+          <w:p>
+            <w:pPr>
+              <w:spacing w:after="30"/>
+              <w:ind w:left="230" w:hanging="230"/>
+            </w:pPr>
+            <w:r>
+              <w:rPr>
+                <w:rFonts w:ascii="Schibsted Grotesk" w:hAnsi="Schibsted Grotesk"/>
+                <w:b w:val="0"/>
+                <w:i w:val="0"/>
+                <w:color w:val="2D4DF5"/>
+                <w:sz w:val="14"/>
+              </w:rPr>
+              <w:t xml:space="preserve">◆  </w:t>
+            </w:r>
+            <w:r>
+              <w:rPr>
+                <w:rFonts w:ascii="Schibsted Grotesk" w:hAnsi="Schibsted Grotesk"/>
+                <w:b w:val="0"/>
+                <w:i w:val="0"/>
+                <w:color w:val="5A4F41"/>
+                <w:sz w:val="18"/>
+              </w:rPr>
+              <w:t>Led the Tech Team and walk-in Support Center, coaching consultants through complex technical and customer issues.</w:t>
+            </w:r>
+          </w:p>
+          <w:p>
+            <w:pPr>
+              <w:spacing w:after="30"/>
+              <w:ind w:left="230" w:hanging="230"/>
+            </w:pPr>
+            <w:r>
+              <w:rPr>
+                <w:rFonts w:ascii="Schibsted Grotesk" w:hAnsi="Schibsted Grotesk"/>
+                <w:b w:val="0"/>
+                <w:i w:val="0"/>
+                <w:color w:val="2D4DF5"/>
+                <w:sz w:val="14"/>
+              </w:rPr>
+              <w:t xml:space="preserve">◆  </w:t>
+            </w:r>
+            <w:r>
+              <w:rPr>
+                <w:rFonts w:ascii="Schibsted Grotesk" w:hAnsi="Schibsted Grotesk"/>
+                <w:b w:val="0"/>
+                <w:i w:val="0"/>
+                <w:color w:val="5A4F41"/>
+                <w:sz w:val="18"/>
+              </w:rPr>
+              <w:t>Drove campus-wide support for labs, printers, and classroom tech — from preemptive checks to urgent in-person requests.</w:t>
+            </w:r>
+          </w:p>
+          <w:p>
+            <w:pPr>
+              <w:tabs>
+                <w:tab w:pos="6235" w:val="right"/>
+              </w:tabs>
+              <w:spacing w:before="80"/>
+            </w:pPr>
+            <w:r>
+              <w:rPr>
+                <w:rFonts w:ascii="Fraunces" w:hAnsi="Fraunces"/>
+                <w:b/>
+                <w:i w:val="0"/>
+                <w:color w:val="211B14"/>
+                <w:sz w:val="22"/>
+              </w:rPr>
+              <w:t>TCC Tech Team</w:t>
+            </w:r>
+            <w:r>
+              <w:rPr>
+                <w:rFonts w:ascii="Space Mono" w:hAnsi="Space Mono"/>
+                <w:b w:val="0"/>
+                <w:i w:val="0"/>
+                <w:color w:val="5A4F41"/>
+                <w:sz w:val="15"/>
+              </w:rPr>
+              <w:tab/>
+              <w:t>Nov 2023 – May 2024</w:t>
+            </w:r>
+          </w:p>
+          <w:p>
+            <w:pPr>
+              <w:spacing w:after="30"/>
+              <w:ind w:left="230" w:hanging="230"/>
+            </w:pPr>
+            <w:r>
+              <w:rPr>
+                <w:rFonts w:ascii="Schibsted Grotesk" w:hAnsi="Schibsted Grotesk"/>
+                <w:b w:val="0"/>
+                <w:i w:val="0"/>
+                <w:color w:val="2D4DF5"/>
+                <w:sz w:val="14"/>
+              </w:rPr>
+              <w:t xml:space="preserve">◆  </w:t>
+            </w:r>
+            <w:r>
+              <w:rPr>
+                <w:rFonts w:ascii="Schibsted Grotesk" w:hAnsi="Schibsted Grotesk"/>
+                <w:b w:val="0"/>
+                <w:i w:val="0"/>
+                <w:color w:val="5A4F41"/>
+                <w:sz w:val="18"/>
+              </w:rPr>
+              <w:t>Resolved client tickets across virtual, in-office, and in-room appointments, and set up wired/wireless connectivity for campus residents.</w:t>
+            </w:r>
+          </w:p>
+          <w:p>
+            <w:pPr>
+              <w:tabs>
+                <w:tab w:pos="6235" w:val="right"/>
+              </w:tabs>
+              <w:spacing w:before="80"/>
+            </w:pPr>
+            <w:r>
+              <w:rPr>
+                <w:rFonts w:ascii="Fraunces" w:hAnsi="Fraunces"/>
+                <w:b/>
+                <w:i w:val="0"/>
+                <w:color w:val="211B14"/>
+                <w:sz w:val="22"/>
+              </w:rPr>
+              <w:t>Technology Center Consultant</w:t>
+            </w:r>
+            <w:r>
+              <w:rPr>
+                <w:rFonts w:ascii="Space Mono" w:hAnsi="Space Mono"/>
+                <w:b w:val="0"/>
+                <w:i w:val="0"/>
+                <w:color w:val="5A4F41"/>
+                <w:sz w:val="15"/>
+              </w:rPr>
+              <w:tab/>
+              <w:t>Sep 2023 – Nov 2023</w:t>
+            </w:r>
+          </w:p>
+          <w:p>
+            <w:pPr>
+              <w:spacing w:after="30"/>
+              <w:ind w:left="230" w:hanging="230"/>
+            </w:pPr>
+            <w:r>
+              <w:rPr>
+                <w:rFonts w:ascii="Schibsted Grotesk" w:hAnsi="Schibsted Grotesk"/>
+                <w:b w:val="0"/>
+                <w:i w:val="0"/>
+                <w:color w:val="2D4DF5"/>
+                <w:sz w:val="14"/>
+              </w:rPr>
+              <w:t xml:space="preserve">◆  </w:t>
+            </w:r>
+            <w:r>
+              <w:rPr>
+                <w:rFonts w:ascii="Schibsted Grotesk" w:hAnsi="Schibsted Grotesk"/>
+                <w:b w:val="0"/>
+                <w:i w:val="0"/>
+                <w:color w:val="5A4F41"/>
+                <w:sz w:val="18"/>
+              </w:rPr>
+              <w:t>Troubleshot software and printer issues for walk-in clients and kept lab equipment stocked and organized.</w:t>
+            </w:r>
+          </w:p>
+          <w:p>
+            <w:pPr>
+              <w:spacing w:after="30"/>
+              <w:ind w:left="230" w:hanging="230"/>
+            </w:pPr>
+            <w:r>
+              <w:rPr>
+                <w:rFonts w:ascii="Schibsted Grotesk" w:hAnsi="Schibsted Grotesk"/>
+                <w:b w:val="0"/>
+                <w:i w:val="0"/>
+                <w:color w:val="2D4DF5"/>
+                <w:sz w:val="14"/>
+              </w:rPr>
+              <w:t xml:space="preserve">◆  </w:t>
+            </w:r>
+            <w:r>
+              <w:rPr>
+                <w:rFonts w:ascii="Schibsted Grotesk" w:hAnsi="Schibsted Grotesk"/>
+                <w:b w:val="0"/>
+                <w:i w:val="0"/>
+                <w:color w:val="5A4F41"/>
+                <w:sz w:val="18"/>
+              </w:rPr>
+              <w:t>Logged and tracked issues in ticketing systems, producing customer and lab reports.</w:t>
+            </w:r>
+          </w:p>
+        </w:tc>
+        <w:tc>
+          <w:tcPr>
+            <w:tcW w:type="dxa" w:w="3960"/>
+            <w:shd w:val="clear" w:fill="EFE4CA"/>
+            <w:tcMar>
+              <w:top w:w="120" w:type="dxa"/>
+              <w:start w:w="170" w:type="dxa"/>
+              <w:bottom w:w="140" w:type="dxa"/>
+              <w:end w:w="140" w:type="dxa"/>
+            </w:tcMar>
+          </w:tcPr>
+          <w:p>
+            <w:pPr>
+              <w:spacing w:before="180" w:after="60"/>
+            </w:pPr>
+            <w:r>
+              <w:rPr>
+                <w:rFonts w:ascii="Space Mono" w:hAnsi="Space Mono"/>
+                <w:b/>
+                <w:i w:val="0"/>
+                <w:color w:val="2D4DF5"/>
+                <w:sz w:val="18"/>
+              </w:rPr>
+              <w:t xml:space="preserve">■ </w:t>
+            </w:r>
+            <w:r>
+              <w:rPr>
+                <w:rFonts w:ascii="Space Mono" w:hAnsi="Space Mono"/>
+                <w:b/>
+                <w:i w:val="0"/>
+                <w:color w:val="211B14"/>
+                <w:sz w:val="18"/>
+              </w:rPr>
+              <w:t>SKILLS</w:t>
+            </w:r>
+          </w:p>
+          <w:p>
+            <w:pPr>
+              <w:spacing w:before="60" w:after="0"/>
+            </w:pPr>
+            <w:r>
+              <w:rPr>
+                <w:rFonts w:ascii="Space Mono" w:hAnsi="Space Mono"/>
+                <w:b/>
+                <w:i w:val="0"/>
+                <w:color w:val="211B14"/>
+                <w:sz w:val="15"/>
+              </w:rPr>
+              <w:t>Languages</w:t>
+            </w:r>
+          </w:p>
+          <w:p>
+            <w:pPr>
+              <w:spacing w:after="0"/>
+            </w:pPr>
+            <w:r>
+              <w:rPr>
+                <w:rFonts w:ascii="Schibsted Grotesk" w:hAnsi="Schibsted Grotesk"/>
+                <w:b w:val="0"/>
+                <w:i w:val="0"/>
+                <w:color w:val="5A4F41"/>
+                <w:sz w:val="17"/>
+              </w:rPr>
+              <w:t>JavaScript, Python, PHP, MySQL</w:t>
+            </w:r>
+          </w:p>
+          <w:p>
+            <w:pPr>
+              <w:spacing w:before="60" w:after="0"/>
+            </w:pPr>
+            <w:r>
+              <w:rPr>
+                <w:rFonts w:ascii="Space Mono" w:hAnsi="Space Mono"/>
+                <w:b/>
+                <w:i w:val="0"/>
+                <w:color w:val="211B14"/>
+                <w:sz w:val="15"/>
+              </w:rPr>
+              <w:t>Web &amp; Frameworks</w:t>
+            </w:r>
+          </w:p>
+          <w:p>
+            <w:pPr>
+              <w:spacing w:after="0"/>
+            </w:pPr>
+            <w:r>
+              <w:rPr>
+                <w:rFonts w:ascii="Schibsted Grotesk" w:hAnsi="Schibsted Grotesk"/>
+                <w:b w:val="0"/>
+                <w:i w:val="0"/>
+                <w:color w:val="5A4F41"/>
+                <w:sz w:val="17"/>
+              </w:rPr>
+              <w:t>React / Next.js, HTML, CSS, Firebase, Git</w:t>
+            </w:r>
+          </w:p>
+          <w:p>
+            <w:pPr>
+              <w:spacing w:before="60" w:after="0"/>
+            </w:pPr>
+            <w:r>
+              <w:rPr>
+                <w:rFonts w:ascii="Space Mono" w:hAnsi="Space Mono"/>
+                <w:b/>
+                <w:i w:val="0"/>
+                <w:color w:val="211B14"/>
+                <w:sz w:val="15"/>
+              </w:rPr>
+              <w:t>Design</w:t>
+            </w:r>
+          </w:p>
+          <w:p>
+            <w:pPr>
+              <w:spacing w:after="0"/>
+            </w:pPr>
+            <w:r>
+              <w:rPr>
+                <w:rFonts w:ascii="Schibsted Grotesk" w:hAnsi="Schibsted Grotesk"/>
+                <w:b w:val="0"/>
+                <w:i w:val="0"/>
+                <w:color w:val="5A4F41"/>
+                <w:sz w:val="17"/>
+              </w:rPr>
+              <w:t>Figma, UX &amp; HCI Design, Web Design, Tableau</w:t>
+            </w:r>
+          </w:p>
+          <w:p>
+            <w:pPr>
+              <w:spacing w:before="60" w:after="0"/>
+            </w:pPr>
+            <w:r>
+              <w:rPr>
+                <w:rFonts w:ascii="Space Mono" w:hAnsi="Space Mono"/>
+                <w:b/>
+                <w:i w:val="0"/>
+                <w:color w:val="211B14"/>
+                <w:sz w:val="15"/>
+              </w:rPr>
+              <w:t>Operating Systems</w:t>
+            </w:r>
+          </w:p>
+          <w:p>
+            <w:pPr>
+              <w:spacing w:after="0"/>
+            </w:pPr>
+            <w:r>
+              <w:rPr>
+                <w:rFonts w:ascii="Schibsted Grotesk" w:hAnsi="Schibsted Grotesk"/>
+                <w:b w:val="0"/>
+                <w:i w:val="0"/>
+                <w:color w:val="5A4F41"/>
+                <w:sz w:val="17"/>
+              </w:rPr>
+              <w:t>Linux, macOS, Windows 10/11, Windows Server</w:t>
+            </w:r>
+          </w:p>
+          <w:p>
+            <w:pPr>
+              <w:spacing w:before="60" w:after="0"/>
+            </w:pPr>
+            <w:r>
+              <w:rPr>
+                <w:rFonts w:ascii="Space Mono" w:hAnsi="Space Mono"/>
+                <w:b/>
+                <w:i w:val="0"/>
+                <w:color w:val="211B14"/>
+                <w:sz w:val="15"/>
+              </w:rPr>
+              <w:t>Tools</w:t>
+            </w:r>
+          </w:p>
+          <w:p>
+            <w:pPr>
+              <w:spacing w:after="0"/>
+            </w:pPr>
+            <w:r>
+              <w:rPr>
+                <w:rFonts w:ascii="Schibsted Grotesk" w:hAnsi="Schibsted Grotesk"/>
+                <w:b w:val="0"/>
+                <w:i w:val="0"/>
+                <w:color w:val="5A4F41"/>
+                <w:sz w:val="17"/>
+              </w:rPr>
+              <w:t>Active Directory, Office365, VirtualBox, VMware, VS Code, WSL</w:t>
+            </w:r>
+          </w:p>
+          <w:p>
+            <w:pPr>
+              <w:spacing w:before="180" w:after="60"/>
+            </w:pPr>
+            <w:r>
+              <w:rPr>
+                <w:rFonts w:ascii="Space Mono" w:hAnsi="Space Mono"/>
+                <w:b/>
+                <w:i w:val="0"/>
+                <w:color w:val="82990A"/>
+                <w:sz w:val="18"/>
+              </w:rPr>
+              <w:t xml:space="preserve">■ </w:t>
+            </w:r>
+            <w:r>
+              <w:rPr>
+                <w:rFonts w:ascii="Space Mono" w:hAnsi="Space Mono"/>
+                <w:b/>
+                <w:i w:val="0"/>
+                <w:color w:val="211B14"/>
+                <w:sz w:val="18"/>
+              </w:rPr>
+              <w:t>CERTIFICATIONS</w:t>
+            </w:r>
+          </w:p>
+          <w:p>
+            <w:pPr>
+              <w:spacing w:after="30"/>
+              <w:ind w:left="230" w:hanging="230"/>
+            </w:pPr>
+            <w:r>
+              <w:rPr>
+                <w:rFonts w:ascii="Schibsted Grotesk" w:hAnsi="Schibsted Grotesk"/>
+                <w:b w:val="0"/>
+                <w:i w:val="0"/>
+                <w:color w:val="82990A"/>
+                <w:sz w:val="14"/>
+              </w:rPr>
+              <w:t xml:space="preserve">◆  </w:t>
+            </w:r>
+            <w:r>
+              <w:rPr>
+                <w:rFonts w:ascii="Schibsted Grotesk" w:hAnsi="Schibsted Grotesk"/>
+                <w:b w:val="0"/>
+                <w:i w:val="0"/>
+                <w:color w:val="5A4F41"/>
+                <w:sz w:val="18"/>
+              </w:rPr>
+              <w:t>Certiport ITS — Computational Thinking, Cybersecurity, Device Configuration &amp; Management, Network Security &amp; Networking</w:t>
+            </w:r>
+          </w:p>
+          <w:p>
+            <w:pPr>
+              <w:spacing w:after="30"/>
+              <w:ind w:left="230" w:hanging="230"/>
+            </w:pPr>
+            <w:r>
+              <w:rPr>
+                <w:rFonts w:ascii="Schibsted Grotesk" w:hAnsi="Schibsted Grotesk"/>
+                <w:b w:val="0"/>
+                <w:i w:val="0"/>
+                <w:color w:val="82990A"/>
+                <w:sz w:val="14"/>
+              </w:rPr>
+              <w:t xml:space="preserve">◆  </w:t>
+            </w:r>
+            <w:r>
+              <w:rPr>
+                <w:rFonts w:ascii="Schibsted Grotesk" w:hAnsi="Schibsted Grotesk"/>
+                <w:b w:val="0"/>
+                <w:i w:val="0"/>
+                <w:color w:val="5A4F41"/>
+                <w:sz w:val="18"/>
+              </w:rPr>
+              <w:t>Cisco Certified Support Technician — Cybersecurity</w:t>
+            </w:r>
+          </w:p>
+          <w:p>
+            <w:pPr>
+              <w:spacing w:after="30"/>
+              <w:ind w:left="230" w:hanging="230"/>
+            </w:pPr>
+            <w:r>
+              <w:rPr>
+                <w:rFonts w:ascii="Schibsted Grotesk" w:hAnsi="Schibsted Grotesk"/>
+                <w:b w:val="0"/>
+                <w:i w:val="0"/>
+                <w:color w:val="82990A"/>
+                <w:sz w:val="14"/>
+              </w:rPr>
+              <w:t xml:space="preserve">◆  </w:t>
+            </w:r>
+            <w:r>
+              <w:rPr>
+                <w:rFonts w:ascii="Schibsted Grotesk" w:hAnsi="Schibsted Grotesk"/>
+                <w:b w:val="0"/>
+                <w:i w:val="0"/>
+                <w:color w:val="5A4F41"/>
+                <w:sz w:val="18"/>
+              </w:rPr>
+              <w:t>Cisco IT Essentials</w:t>
+            </w:r>
+          </w:p>
+          <w:p>
+            <w:pPr>
+              <w:spacing w:after="30"/>
+              <w:ind w:left="230" w:hanging="230"/>
+            </w:pPr>
+            <w:r>
+              <w:rPr>
+                <w:rFonts w:ascii="Schibsted Grotesk" w:hAnsi="Schibsted Grotesk"/>
+                <w:b w:val="0"/>
+                <w:i w:val="0"/>
+                <w:color w:val="82990A"/>
+                <w:sz w:val="14"/>
+              </w:rPr>
+              <w:t xml:space="preserve">◆  </w:t>
+            </w:r>
+            <w:r>
+              <w:rPr>
+                <w:rFonts w:ascii="Schibsted Grotesk" w:hAnsi="Schibsted Grotesk"/>
+                <w:b w:val="0"/>
+                <w:i w:val="0"/>
+                <w:color w:val="5A4F41"/>
+                <w:sz w:val="18"/>
+              </w:rPr>
+              <w:t>TestOut PC Pro</w:t>
+            </w:r>
+          </w:p>
+          <w:p>
+            <w:pPr>
+              <w:spacing w:before="180" w:after="60"/>
+            </w:pPr>
+            <w:r>
+              <w:rPr>
+                <w:rFonts w:ascii="Space Mono" w:hAnsi="Space Mono"/>
+                <w:b/>
+                <w:i w:val="0"/>
+                <w:color w:val="D8539B"/>
+                <w:sz w:val="18"/>
+              </w:rPr>
+              <w:t xml:space="preserve">■ </w:t>
+            </w:r>
+            <w:r>
+              <w:rPr>
+                <w:rFonts w:ascii="Space Mono" w:hAnsi="Space Mono"/>
+                <w:b/>
+                <w:i w:val="0"/>
+                <w:color w:val="211B14"/>
+                <w:sz w:val="18"/>
+              </w:rPr>
+              <w:t>OFF THE CLOCK</w:t>
+            </w:r>
+          </w:p>
+          <w:p>
+            <w:r>
+              <w:rPr>
+                <w:rFonts w:ascii="Schibsted Grotesk" w:hAnsi="Schibsted Grotesk"/>
+                <w:b w:val="0"/>
+                <w:i w:val="0"/>
+                <w:color w:val="5A4F41"/>
+                <w:sz w:val="17"/>
+              </w:rPr>
+              <w:t>Caving · Coffee · Gym · Hiking · PC building · Custom keyboards · Plants · Reading · Swimming</w:t>
+            </w:r>
+          </w:p>
+        </w:tc>
+      </w:tr>
+    </w:tbl>
     <w:sectPr>
       <w:pgSz w:w="12240" w:h="15840"/>
-      <w:pgMar w:top="792" w:right="1008" w:bottom="720" w:left="1008" w:header="720" w:footer="720" w:gutter="0"/>
+      <w:pgMar w:top="720" w:right="864" w:bottom="648" w:left="864" w:header="720" w:footer="720" w:gutter="0"/>
       <w:cols w:space="720"/>
       <w:docGrid w:linePitch="360"/>
     </w:sectPr>
@@ -1288,12 +1394,12 @@
     <w:qFormat/>
     <w:rsid w:val="00FC693F"/>
     <w:pPr>
-      <w:spacing w:before="0" w:after="0" w:line="269" w:lineRule="auto"/>
+      <w:spacing w:before="0" w:after="0" w:line="254" w:lineRule="auto"/>
     </w:pPr>
     <w:rPr>
       <w:rFonts w:ascii="Schibsted Grotesk" w:hAnsi="Schibsted Grotesk"/>
       <w:color w:val="5A4F41"/>
-      <w:sz w:val="20"/>
+      <w:sz w:val="19"/>
     </w:rPr>
   </w:style>
   <w:style w:type="paragraph" w:styleId="Header">

</xml_diff>

<commit_message>
Résumé docx: right-align contacts beside the name in the header
Header is now a two-cell row — name/role left, contact links stacked and
right-aligned on the right (matching the HTML), with the ink rule beneath
— instead of a single contact line across the bottom.
</commit_message>
<xml_diff>
--- a/resume/Gabriel-Harlan-Resume.docx
+++ b/resume/Gabriel-Harlan-Resume.docx
@@ -2,62 +2,181 @@
 <file path=word/document.xml><?xml version="1.0" encoding="utf-8"?>
 <w:document xmlns:wpc="http://schemas.microsoft.com/office/word/2010/wordprocessingCanvas" xmlns:mo="http://schemas.microsoft.com/office/mac/office/2008/main" xmlns:mc="http://schemas.openxmlformats.org/markup-compatibility/2006" xmlns:mv="urn:schemas-microsoft-com:mac:vml" xmlns:o="urn:schemas-microsoft-com:office:office" xmlns:r="http://schemas.openxmlformats.org/officeDocument/2006/relationships" xmlns:m="http://schemas.openxmlformats.org/officeDocument/2006/math" xmlns:v="urn:schemas-microsoft-com:vml" xmlns:wp14="http://schemas.microsoft.com/office/word/2010/wordprocessingDrawing" xmlns:wp="http://schemas.openxmlformats.org/drawingml/2006/wordprocessingDrawing" xmlns:w10="urn:schemas-microsoft-com:office:word" xmlns:w="http://schemas.openxmlformats.org/wordprocessingml/2006/main" xmlns:w14="http://schemas.microsoft.com/office/word/2010/wordml" xmlns:wpg="http://schemas.microsoft.com/office/word/2010/wordprocessingGroup" xmlns:wpi="http://schemas.microsoft.com/office/word/2010/wordprocessingInk" xmlns:wne="http://schemas.microsoft.com/office/word/2006/wordml" xmlns:wps="http://schemas.microsoft.com/office/word/2010/wordprocessingShape" mc:Ignorable="w14 wp14">
   <w:body>
+    <w:tbl>
+      <w:tblPr>
+        <w:tblW w:type="auto" w:w="0"/>
+        <w:jc w:val="left"/>
+        <w:tblLook w:firstColumn="1" w:firstRow="1" w:lastColumn="0" w:lastRow="0" w:noHBand="0" w:noVBand="1" w:val="04A0"/>
+        <w:tblBorders>
+          <w:top w:val="none"/>
+          <w:left w:val="none"/>
+          <w:right w:val="none"/>
+          <w:insideH w:val="none"/>
+          <w:insideV w:val="none"/>
+          <w:bottom w:val="single" w:sz="18" w:space="4" w:color="211B14"/>
+        </w:tblBorders>
+        <w:tblLayout w:type="fixed"/>
+        <w:tblW w:w="10512" w:type="dxa"/>
+      </w:tblPr>
+      <w:tblGrid>
+        <w:gridCol w:w="6336"/>
+        <w:gridCol w:w="4176"/>
+      </w:tblGrid>
+      <w:tr>
+        <w:tc>
+          <w:tcPr>
+            <w:tcW w:type="dxa" w:w="6336"/>
+            <w:vAlign w:val="bottom"/>
+            <w:tcMar>
+              <w:top w:w="0" w:type="dxa"/>
+              <w:start w:w="0" w:type="dxa"/>
+              <w:bottom w:w="40" w:type="dxa"/>
+              <w:end w:w="0" w:type="dxa"/>
+            </w:tcMar>
+          </w:tcPr>
+          <w:p>
+            <w:pPr>
+              <w:spacing w:after="20"/>
+            </w:pPr>
+            <w:r>
+              <w:rPr>
+                <w:rFonts w:ascii="Fraunces" w:hAnsi="Fraunces"/>
+                <w:b/>
+                <w:i w:val="0"/>
+                <w:color w:val="211B14"/>
+                <w:sz w:val="56"/>
+              </w:rPr>
+              <w:t>Gabriel Harlan</w:t>
+            </w:r>
+            <w:r>
+              <w:rPr>
+                <w:rFonts w:ascii="Fraunces" w:hAnsi="Fraunces"/>
+                <w:b/>
+                <w:i w:val="0"/>
+                <w:color w:val="F4502A"/>
+                <w:sz w:val="56"/>
+              </w:rPr>
+              <w:t>.</w:t>
+            </w:r>
+          </w:p>
+          <w:p>
+            <w:pPr>
+              <w:spacing w:after="0"/>
+            </w:pPr>
+            <w:r>
+              <w:rPr>
+                <w:rFonts w:ascii="Space Mono" w:hAnsi="Space Mono"/>
+                <w:b w:val="0"/>
+                <w:i w:val="0"/>
+                <w:color w:val="5A4F41"/>
+                <w:sz w:val="17"/>
+              </w:rPr>
+              <w:t>Web &amp; UX Designer · Informatics @ Indiana University</w:t>
+            </w:r>
+          </w:p>
+        </w:tc>
+        <w:tc>
+          <w:tcPr>
+            <w:tcW w:type="dxa" w:w="4176"/>
+            <w:vAlign w:val="bottom"/>
+            <w:tcMar>
+              <w:top w:w="0" w:type="dxa"/>
+              <w:start w:w="0" w:type="dxa"/>
+              <w:bottom w:w="40" w:type="dxa"/>
+              <w:end w:w="0" w:type="dxa"/>
+            </w:tcMar>
+          </w:tcPr>
+          <w:p>
+            <w:pPr>
+              <w:spacing w:after="0" w:line="276" w:lineRule="auto"/>
+              <w:jc w:val="right"/>
+            </w:pPr>
+            <w:r>
+              <w:rPr>
+                <w:rFonts w:ascii="Space Mono" w:hAnsi="Space Mono"/>
+                <w:b w:val="0"/>
+                <w:i w:val="0"/>
+                <w:color w:val="211B14"/>
+                <w:sz w:val="16"/>
+              </w:rPr>
+              <w:t>gbharlan@iu.edu</w:t>
+            </w:r>
+          </w:p>
+          <w:p>
+            <w:pPr>
+              <w:spacing w:after="0" w:line="276" w:lineRule="auto"/>
+              <w:jc w:val="right"/>
+            </w:pPr>
+            <w:r>
+              <w:rPr>
+                <w:rFonts w:ascii="Space Mono" w:hAnsi="Space Mono"/>
+                <w:b w:val="0"/>
+                <w:i w:val="0"/>
+                <w:color w:val="211B14"/>
+                <w:sz w:val="16"/>
+              </w:rPr>
+              <w:t>gabrielharlan.is-a.dev</w:t>
+            </w:r>
+          </w:p>
+          <w:p>
+            <w:pPr>
+              <w:spacing w:after="0" w:line="276" w:lineRule="auto"/>
+              <w:jc w:val="right"/>
+            </w:pPr>
+            <w:r>
+              <w:rPr>
+                <w:rFonts w:ascii="Space Mono" w:hAnsi="Space Mono"/>
+                <w:b w:val="0"/>
+                <w:i w:val="0"/>
+                <w:color w:val="211B14"/>
+                <w:sz w:val="16"/>
+              </w:rPr>
+              <w:t>linkedin.com/in/gbharlan</w:t>
+            </w:r>
+          </w:p>
+          <w:p>
+            <w:pPr>
+              <w:spacing w:after="0" w:line="276" w:lineRule="auto"/>
+              <w:jc w:val="right"/>
+            </w:pPr>
+            <w:r>
+              <w:rPr>
+                <w:rFonts w:ascii="Space Mono" w:hAnsi="Space Mono"/>
+                <w:b w:val="0"/>
+                <w:i w:val="0"/>
+                <w:color w:val="211B14"/>
+                <w:sz w:val="16"/>
+              </w:rPr>
+              <w:t>github.com/gabeusgong</w:t>
+            </w:r>
+          </w:p>
+          <w:p>
+            <w:pPr>
+              <w:spacing w:after="0" w:line="276" w:lineRule="auto"/>
+              <w:jc w:val="right"/>
+            </w:pPr>
+            <w:r>
+              <w:rPr>
+                <w:rFonts w:ascii="Space Mono" w:hAnsi="Space Mono"/>
+                <w:b w:val="0"/>
+                <w:i w:val="0"/>
+                <w:color w:val="211B14"/>
+                <w:sz w:val="16"/>
+              </w:rPr>
+              <w:t>Bloomington, IN</w:t>
+            </w:r>
+          </w:p>
+        </w:tc>
+      </w:tr>
+    </w:tbl>
     <w:p>
       <w:pPr>
-        <w:spacing w:after="20"/>
+        <w:spacing w:after="120" w:line="240" w:lineRule="auto"/>
       </w:pPr>
       <w:r>
         <w:rPr>
-          <w:rFonts w:ascii="Fraunces" w:hAnsi="Fraunces"/>
-          <w:b/>
-          <w:i w:val="0"/>
-          <w:color w:val="211B14"/>
-          <w:sz w:val="60"/>
+          <w:sz w:val="6"/>
         </w:rPr>
-        <w:t>Gabriel Harlan</w:t>
-      </w:r>
-      <w:r>
-        <w:rPr>
-          <w:rFonts w:ascii="Fraunces" w:hAnsi="Fraunces"/>
-          <w:b/>
-          <w:i w:val="0"/>
-          <w:color w:val="F4502A"/>
-          <w:sz w:val="60"/>
-        </w:rPr>
-        <w:t>.</w:t>
-      </w:r>
-    </w:p>
-    <w:p>
-      <w:pPr>
-        <w:spacing w:after="40"/>
-      </w:pPr>
-      <w:r>
-        <w:rPr>
-          <w:rFonts w:ascii="Space Mono" w:hAnsi="Space Mono"/>
-          <w:b w:val="0"/>
-          <w:i w:val="0"/>
-          <w:color w:val="5A4F41"/>
-          <w:sz w:val="17"/>
-        </w:rPr>
-        <w:t>Web &amp; UX Designer  ·  Informatics @ Indiana University</w:t>
-      </w:r>
-    </w:p>
-    <w:p>
-      <w:pPr>
-        <w:pBdr>
-          <w:bottom w:val="single" w:sz="18" w:space="4" w:color="211B14"/>
-        </w:pBdr>
-        <w:spacing w:after="160"/>
-      </w:pPr>
-      <w:r>
-        <w:rPr>
-          <w:rFonts w:ascii="Space Mono" w:hAnsi="Space Mono"/>
-          <w:b w:val="0"/>
-          <w:i w:val="0"/>
-          <w:color w:val="211B14"/>
-          <w:sz w:val="16"/>
-        </w:rPr>
-        <w:t>gbharlan@iu.edu   ·   gabrielharlan.is-a.dev   ·   linkedin.com/in/gbharlan   ·   github.com/gabeusgong   ·   Bloomington, IN</w:t>
       </w:r>
     </w:p>
     <w:tbl>

</xml_diff>